<commit_message>
Enhance README and database handling: Updated README instructions for activating the virtual environment and added alternative methods. Modified database connection logic to ensure .env variables override stale shell environment variables. Improved FastAPI main application with detailed comments, added global exception handling for database connection errors, and implemented background task handling for workflow creation. Updated models to use a PostgreSQL sequence for generating human-readable workflow IDs, ensuring thread safety during concurrent requests. Revised database schema creation script and documentation to reflect these changes.
</commit_message>
<xml_diff>
--- a/documents/agentflow_database_adr.docx
+++ b/documents/agentflow_database_adr.docx
@@ -2324,12 +2324,7 @@
         <w:spacing w:after="60" w:before="60"/>
       </w:pPr>
       <w:r>
-        <w:rPr>
-          <w:rFonts w:ascii="Arial" w:cs="Arial" w:eastAsia="Arial" w:hAnsi="Arial"/>
-          <w:sz w:val="22"/>
-          <w:szCs w:val="22"/>
-        </w:rPr>
-        <w:t xml:space="preserve">Stores one row per user request. Created the moment a user submits a goal. The status column drives the entire lifecycle. The result column stores the final assembled output once all tasks complete.</w:t>
+        <w:t>Stores one row per user request. Created the moment a user submits a goal. The request_id column is a human-readable public id (WF_1, WF_2, …) assigned by Postgres sequence workflow_request_id_seq — not by application code — so concurrent POST /workflows cannot collide. The status column drives the lifecycle. The result column stores the final assembled JSONB output when complete.</w:t>
       </w:r>
     </w:p>
     <w:p>
@@ -6993,6 +6988,28 @@
       </w:pPr>
       <w:r>
         <w:t xml:space="preserve"/>
+      </w:r>
+    </w:p>
+    <w:p>
+      <w:r>
+        <w:t>Problem: Python max+1 id generation in main.py races under concurrent inserts — two requests can compute the same WF_N and one fails UNIQUE or requires locking.</w:t>
+        <w:br/>
+        <w:br/>
+        <w:t>Decision: CREATE SEQUENCE workflow_request_id_seq; column default 'WF_' || nextval('workflow_request_id_seq')::text. nextval() is atomic in Postgres.</w:t>
+        <w:br/>
+        <w:br/>
+        <w:t>Consequences: table_creation.sql owns id generation; models.py uses server_default on request_id; main.py omits request_id on INSERT and db.refresh() reads it back. Existing databases run the migration block at the bottom of table_creation.sql once.</w:t>
+        <w:br/>
+        <w:br/>
+        <w:t>Rejected alternatives: Python max+1 (race); UUID in request_id (poor UX for polling); Redis INCR (extra infra for V1).</w:t>
+      </w:r>
+    </w:p>
+    <w:p>
+      <w:pPr>
+        <w:pStyle w:val="Heading2"/>
+      </w:pPr>
+      <w:r>
+        <w:t>request_id via Postgres sequence (May 2026)</w:t>
       </w:r>
     </w:p>
     <w:p>

</xml_diff>